<commit_message>
Updated report and added PDF version
</commit_message>
<xml_diff>
--- a/report/Newton_Capstone_Azure End-to-End ETL.docx
+++ b/report/Newton_Capstone_Azure End-to-End ETL.docx
@@ -1766,9 +1766,9 @@
           <w:noProof/>
         </w:rPr>
         <w:drawing>
-          <wp:inline distT="0" distB="0" distL="0" distR="0" wp14:anchorId="69E73859" wp14:editId="0A765D5F">
-            <wp:extent cx="6090138" cy="3464484"/>
-            <wp:effectExtent l="0" t="0" r="6350" b="3175"/>
+          <wp:inline distT="0" distB="0" distL="0" distR="0" wp14:anchorId="69E73859" wp14:editId="2EAA1AAD">
+            <wp:extent cx="5486400" cy="3121037"/>
+            <wp:effectExtent l="0" t="0" r="0" b="3175"/>
             <wp:docPr id="2" name="Picture 2"/>
             <wp:cNvGraphicFramePr>
               <a:graphicFrameLocks xmlns:a="http://schemas.openxmlformats.org/drawingml/2006/main" noChangeAspect="1"/>
@@ -1788,7 +1788,7 @@
                   <pic:spPr bwMode="auto">
                     <a:xfrm>
                       <a:off x="0" y="0"/>
-                      <a:ext cx="6113124" cy="3477560"/>
+                      <a:ext cx="5521354" cy="3140921"/>
                     </a:xfrm>
                     <a:prstGeom prst="rect">
                       <a:avLst/>
@@ -1841,6 +1841,127 @@
     <w:p>
       <w:pPr>
         <w:pStyle w:val="Heading1"/>
+        <w:spacing w:before="0" w:after="0" w:line="360" w:lineRule="auto"/>
+        <w:jc w:val="both"/>
+        <w:rPr>
+          <w:b/>
+          <w:bCs/>
+          <w:sz w:val="32"/>
+          <w:szCs w:val="32"/>
+        </w:rPr>
+      </w:pPr>
+      <w:r>
+        <w:rPr>
+          <w:b/>
+          <w:bCs/>
+          <w:sz w:val="32"/>
+          <w:szCs w:val="32"/>
+        </w:rPr>
+        <w:t xml:space="preserve">Figure </w:t>
+      </w:r>
+      <w:r>
+        <w:rPr>
+          <w:b/>
+          <w:bCs/>
+          <w:sz w:val="32"/>
+          <w:szCs w:val="32"/>
+        </w:rPr>
+        <w:t>1</w:t>
+      </w:r>
+      <w:r>
+        <w:rPr>
+          <w:b/>
+          <w:bCs/>
+          <w:sz w:val="32"/>
+          <w:szCs w:val="32"/>
+        </w:rPr>
+        <w:t>3</w:t>
+      </w:r>
+      <w:r>
+        <w:rPr>
+          <w:b/>
+          <w:bCs/>
+          <w:sz w:val="32"/>
+          <w:szCs w:val="32"/>
+        </w:rPr>
+        <w:t xml:space="preserve"> — </w:t>
+      </w:r>
+      <w:r>
+        <w:rPr>
+          <w:b/>
+          <w:bCs/>
+          <w:sz w:val="32"/>
+          <w:szCs w:val="32"/>
+        </w:rPr>
+        <w:t>Publishing project repository to GitHub using Git commands</w:t>
+      </w:r>
+    </w:p>
+    <w:p>
+      <w:r>
+        <w:rPr>
+          <w:noProof/>
+        </w:rPr>
+        <w:drawing>
+          <wp:inline distT="0" distB="0" distL="0" distR="0" wp14:anchorId="16BA7925" wp14:editId="6E7AA1A6">
+            <wp:extent cx="5448300" cy="2894700"/>
+            <wp:effectExtent l="0" t="0" r="0" b="1270"/>
+            <wp:docPr id="6" name="Picture 6"/>
+            <wp:cNvGraphicFramePr>
+              <a:graphicFrameLocks xmlns:a="http://schemas.openxmlformats.org/drawingml/2006/main" noChangeAspect="1"/>
+            </wp:cNvGraphicFramePr>
+            <a:graphic xmlns:a="http://schemas.openxmlformats.org/drawingml/2006/main">
+              <a:graphicData uri="http://schemas.openxmlformats.org/drawingml/2006/picture">
+                <pic:pic xmlns:pic="http://schemas.openxmlformats.org/drawingml/2006/picture">
+                  <pic:nvPicPr>
+                    <pic:cNvPr id="1" name=""/>
+                    <pic:cNvPicPr/>
+                  </pic:nvPicPr>
+                  <pic:blipFill>
+                    <a:blip r:embed="rId23"/>
+                    <a:stretch>
+                      <a:fillRect/>
+                    </a:stretch>
+                  </pic:blipFill>
+                  <pic:spPr>
+                    <a:xfrm>
+                      <a:off x="0" y="0"/>
+                      <a:ext cx="5469486" cy="2905956"/>
+                    </a:xfrm>
+                    <a:prstGeom prst="rect">
+                      <a:avLst/>
+                    </a:prstGeom>
+                  </pic:spPr>
+                </pic:pic>
+              </a:graphicData>
+            </a:graphic>
+          </wp:inline>
+        </w:drawing>
+      </w:r>
+    </w:p>
+    <w:p>
+      <w:r>
+        <w:t>These GitHub commands show command v</w:t>
+      </w:r>
+      <w:r>
+        <w:t>ersion control and project publishing using Git and GitHub</w:t>
+      </w:r>
+      <w:r>
+        <w:t>.</w:t>
+      </w:r>
+    </w:p>
+    <w:p/>
+    <w:p/>
+    <w:p>
+      <w:pPr>
+        <w:rPr>
+          <w:sz w:val="24"/>
+          <w:szCs w:val="24"/>
+        </w:rPr>
+      </w:pPr>
+    </w:p>
+    <w:p>
+      <w:pPr>
+        <w:pStyle w:val="Heading1"/>
         <w:jc w:val="both"/>
         <w:rPr>
           <w:b/>
@@ -1919,7 +2040,7 @@
       </w:pPr>
     </w:p>
     <w:sectPr>
-      <w:footerReference w:type="default" r:id="rId23"/>
+      <w:footerReference w:type="default" r:id="rId24"/>
       <w:pgSz w:w="12240" w:h="15840"/>
       <w:pgMar w:top="1440" w:right="1440" w:bottom="1440" w:left="1440" w:header="708" w:footer="708" w:gutter="0"/>
       <w:cols w:space="708"/>
@@ -3110,7 +3231,6 @@
   <w:style w:type="character" w:default="1" w:styleId="DefaultParagraphFont">
     <w:name w:val="Default Paragraph Font"/>
     <w:uiPriority w:val="1"/>
-    <w:semiHidden/>
     <w:unhideWhenUsed/>
   </w:style>
   <w:style w:type="table" w:default="1" w:styleId="TableNormal">
@@ -3946,6 +4066,14 @@
 </file>
 
 <file path=customXml/item1.xml><?xml version="1.0" encoding="utf-8"?>
+<p:properties xmlns:p="http://schemas.microsoft.com/office/2006/metadata/properties" xmlns:xsi="http://www.w3.org/2001/XMLSchema-instance" xmlns:pc="http://schemas.microsoft.com/office/infopath/2007/PartnerControls">
+  <documentManagement>
+    <_activity xmlns="27645f25-d041-4196-ac00-9ed1f42c3858" xsi:nil="true"/>
+  </documentManagement>
+</p:properties>
+</file>
+
+<file path=customXml/item2.xml><?xml version="1.0" encoding="utf-8"?>
 <?mso-contentType ?>
 <FormTemplates xmlns="http://schemas.microsoft.com/sharepoint/v3/contenttype/forms">
   <Display>DocumentLibraryForm</Display>
@@ -3954,19 +4082,7 @@
 </FormTemplates>
 </file>
 
-<file path=customXml/item2.xml><?xml version="1.0" encoding="utf-8"?>
-<p:properties xmlns:p="http://schemas.microsoft.com/office/2006/metadata/properties" xmlns:xsi="http://www.w3.org/2001/XMLSchema-instance" xmlns:pc="http://schemas.microsoft.com/office/infopath/2007/PartnerControls">
-  <documentManagement>
-    <_activity xmlns="27645f25-d041-4196-ac00-9ed1f42c3858" xsi:nil="true"/>
-  </documentManagement>
-</p:properties>
-</file>
-
 <file path=customXml/item3.xml><?xml version="1.0" encoding="utf-8"?>
-<b:Sources xmlns:b="http://schemas.openxmlformats.org/officeDocument/2006/bibliography" xmlns="http://schemas.openxmlformats.org/officeDocument/2006/bibliography" SelectedStyle="\APASixthEditionOfficeOnline.xsl" StyleName="APA" Version="6"/>
-</file>
-
-<file path=customXml/item4.xml><?xml version="1.0" encoding="utf-8"?>
 <ct:contentTypeSchema xmlns:ct="http://schemas.microsoft.com/office/2006/metadata/contentType" xmlns:ma="http://schemas.microsoft.com/office/2006/metadata/properties/metaAttributes" ct:_="" ma:_="" ma:contentTypeName="Document" ma:contentTypeID="0x01010011BDC545C06E2E46B3E2CF836C58D1E5" ma:contentTypeVersion="5" ma:contentTypeDescription="Create a new document." ma:contentTypeScope="" ma:versionID="cf3ec3afafecc0b5fe052ea41baa85aa">
   <xsd:schema xmlns:xsd="http://www.w3.org/2001/XMLSchema" xmlns:xs="http://www.w3.org/2001/XMLSchema" xmlns:p="http://schemas.microsoft.com/office/2006/metadata/properties" xmlns:ns3="27645f25-d041-4196-ac00-9ed1f42c3858" targetNamespace="http://schemas.microsoft.com/office/2006/metadata/properties" ma:root="true" ma:fieldsID="889ef48e51987cc2ea9d86e2e386ea15" ns3:_="">
     <xsd:import namespace="27645f25-d041-4196-ac00-9ed1f42c3858"/>
@@ -4116,15 +4232,11 @@
 </ct:contentTypeSchema>
 </file>
 
-<file path=customXml/itemProps1.xml><?xml version="1.0" encoding="utf-8"?>
-<ds:datastoreItem xmlns:ds="http://schemas.openxmlformats.org/officeDocument/2006/customXml" ds:itemID="{5FDFDC78-6A8D-425D-BE08-C723B00424BB}">
-  <ds:schemaRefs>
-    <ds:schemaRef ds:uri="http://schemas.microsoft.com/sharepoint/v3/contenttype/forms"/>
-  </ds:schemaRefs>
-</ds:datastoreItem>
+<file path=customXml/item4.xml><?xml version="1.0" encoding="utf-8"?>
+<b:Sources xmlns:b="http://schemas.openxmlformats.org/officeDocument/2006/bibliography" xmlns="http://schemas.openxmlformats.org/officeDocument/2006/bibliography" SelectedStyle="\APASixthEditionOfficeOnline.xsl" StyleName="APA" Version="6"/>
 </file>
 
-<file path=customXml/itemProps2.xml><?xml version="1.0" encoding="utf-8"?>
+<file path=customXml/itemProps1.xml><?xml version="1.0" encoding="utf-8"?>
 <ds:datastoreItem xmlns:ds="http://schemas.openxmlformats.org/officeDocument/2006/customXml" ds:itemID="{D9E25ABB-B433-497C-B577-08EA85C3BBFD}">
   <ds:schemaRefs>
     <ds:schemaRef ds:uri="http://schemas.microsoft.com/office/2006/metadata/properties"/>
@@ -4134,15 +4246,15 @@
 </ds:datastoreItem>
 </file>
 
-<file path=customXml/itemProps3.xml><?xml version="1.0" encoding="utf-8"?>
-<ds:datastoreItem xmlns:ds="http://schemas.openxmlformats.org/officeDocument/2006/customXml" ds:itemID="{39122F95-B31D-4FBF-826B-C6444D5D52A5}">
+<file path=customXml/itemProps2.xml><?xml version="1.0" encoding="utf-8"?>
+<ds:datastoreItem xmlns:ds="http://schemas.openxmlformats.org/officeDocument/2006/customXml" ds:itemID="{5FDFDC78-6A8D-425D-BE08-C723B00424BB}">
   <ds:schemaRefs>
-    <ds:schemaRef ds:uri="http://schemas.openxmlformats.org/officeDocument/2006/bibliography"/>
+    <ds:schemaRef ds:uri="http://schemas.microsoft.com/sharepoint/v3/contenttype/forms"/>
   </ds:schemaRefs>
 </ds:datastoreItem>
 </file>
 
-<file path=customXml/itemProps4.xml><?xml version="1.0" encoding="utf-8"?>
+<file path=customXml/itemProps3.xml><?xml version="1.0" encoding="utf-8"?>
 <ds:datastoreItem xmlns:ds="http://schemas.openxmlformats.org/officeDocument/2006/customXml" ds:itemID="{F7D42EF2-CAA6-4774-BBDC-33A706C49E8F}">
   <ds:schemaRefs>
     <ds:schemaRef ds:uri="http://schemas.microsoft.com/office/2006/metadata/contentType"/>
@@ -4158,4 +4270,12 @@
     <ds:schemaRef ds:uri="http://schemas.microsoft.com/internal/obd"/>
   </ds:schemaRefs>
 </ds:datastoreItem>
+</file>
+
+<file path=customXml/itemProps4.xml><?xml version="1.0" encoding="utf-8"?>
+<ds:datastoreItem xmlns:ds="http://schemas.openxmlformats.org/officeDocument/2006/customXml" ds:itemID="{39122F95-B31D-4FBF-826B-C6444D5D52A5}">
+  <ds:schemaRefs>
+    <ds:schemaRef ds:uri="http://schemas.openxmlformats.org/officeDocument/2006/bibliography"/>
+  </ds:schemaRefs>
+</ds:datastoreItem>
 </file>
</xml_diff>